<commit_message>
refactor(backend)!: extract Diagnostics.* logging library into standalone DiagnosticLog repo/NuGet package
BREAKING CHANGE: src/Shared/Diagnostics.* and tests/Shared/Logs/* no longer exist in this
repo. OCRWeb.API/OCRWeb.Identity now consume Diagnostics.Abstractions/.NLog/.AspNetCore as
NuGet PackageReferences (v0.1.0) instead of ProjectReferences. Source now lives in the
separate DiagnosticLog repo (https://github.com/orangepuff/DiagnosticLog).

Co-Authored-By: Claude Sonnet 5 <noreply@anthropic.com>
</commit_message>
<xml_diff>
--- a/development-plan.docx
+++ b/development-plan.docx
@@ -1,5 +1,27 @@
 
-<file path=word/document.xml><?xml version="1.0" encoding="utf-8"?>
+<file path=docProps\app.xml><?xml version="1.0" encoding="utf-8"?>
+<Properties xmlns="http://schemas.openxmlformats.org/officeDocument/2006/extended-properties" xmlns:vt="http://schemas.openxmlformats.org/officeDocument/2006/docPropsVTypes"/>
+</file>
+
+<file path=docProps\core.xml><?xml version="1.0" encoding="utf-8"?>
+<cp:coreProperties xmlns:cp="http://schemas.openxmlformats.org/package/2006/metadata/core-properties" xmlns:dc="http://purl.org/dc/elements/1.1/" xmlns:dcterms="http://purl.org/dc/terms/" xmlns:dcmitype="http://purl.org/dc/dcmitype/" xmlns:xsi="http://www.w3.org/2001/XMLSchema-instance">
+  <dc:creator>Un-named</dc:creator>
+  <cp:lastModifiedBy>Un-named</cp:lastModifiedBy>
+  <cp:revision>1</cp:revision>
+  <dcterms:created xsi:type="dcterms:W3CDTF">2026-07-18T13:56:26.009Z</dcterms:created>
+  <dcterms:modified xsi:type="dcterms:W3CDTF">2026-07-18T13:56:26.009Z</dcterms:modified>
+</cp:coreProperties>
+</file>
+
+<file path=docProps\custom.xml><?xml version="1.0" encoding="utf-8"?>
+<Properties xmlns="http://schemas.openxmlformats.org/officeDocument/2006/custom-properties" xmlns:vt="http://schemas.openxmlformats.org/officeDocument/2006/docPropsVTypes"/>
+</file>
+
+<file path=word\comments.xml><?xml version="1.0" encoding="utf-8"?>
+<w:comments xmlns:cx="http://schemas.microsoft.com/office/drawing/2014/chartex" xmlns:cx1="http://schemas.microsoft.com/office/drawing/2015/9/8/chartex" xmlns:cx2="http://schemas.microsoft.com/office/drawing/2015/10/21/chartex" xmlns:cx3="http://schemas.microsoft.com/office/drawing/2016/5/9/chartex" xmlns:cx4="http://schemas.microsoft.com/office/drawing/2016/5/10/chartex" xmlns:cx5="http://schemas.microsoft.com/office/drawing/2016/5/11/chartex" xmlns:cx6="http://schemas.microsoft.com/office/drawing/2016/5/12/chartex" xmlns:cx7="http://schemas.microsoft.com/office/drawing/2016/5/13/chartex" xmlns:cx8="http://schemas.microsoft.com/office/drawing/2016/5/14/chartex" xmlns:mc="http://schemas.openxmlformats.org/markup-compatibility/2006" xmlns:aink="http://schemas.microsoft.com/office/drawing/2016/ink" xmlns:am3d="http://schemas.microsoft.com/office/drawing/2017/model3d" xmlns:o="urn:schemas-microsoft-com:office:office" xmlns:r="http://schemas.openxmlformats.org/officeDocument/2006/relationships" xmlns:m="http://schemas.openxmlformats.org/officeDocument/2006/math" xmlns:v="urn:schemas-microsoft-com:vml" xmlns:wp14="http://schemas.microsoft.com/office/word/2010/wordprocessingDrawing" xmlns:wp="http://schemas.openxmlformats.org/drawingml/2006/wordprocessingDrawing" xmlns:w10="urn:schemas-microsoft-com:office:word" xmlns:w="http://schemas.openxmlformats.org/wordprocessingml/2006/main" xmlns:w14="http://schemas.microsoft.com/office/word/2010/wordml" xmlns:w15="http://schemas.microsoft.com/office/word/2012/wordml" xmlns:w16cex="http://schemas.microsoft.com/office/word/2018/wordml/cex" xmlns:w16cid="http://schemas.microsoft.com/office/word/2016/wordml/cid" xmlns:w16="http://schemas.microsoft.com/office/word/2018/wordml" xmlns:w16sdtdh="http://schemas.microsoft.com/office/word/2020/wordml/sdtdatahash" xmlns:w16se="http://schemas.microsoft.com/office/word/2015/wordml/symex" xmlns:wpg="http://schemas.microsoft.com/office/word/2010/wordprocessingGroup" xmlns:wpi="http://schemas.microsoft.com/office/word/2010/wordprocessingInk" xmlns:wne="http://schemas.microsoft.com/office/word/2006/wordml" xmlns:wps="http://schemas.microsoft.com/office/word/2010/wordprocessingShape"/>
+</file>
+
+<file path=word\document.xml><?xml version="1.0" encoding="utf-8"?>
 <w:document xmlns:wpc="http://schemas.microsoft.com/office/word/2010/wordprocessingCanvas" xmlns:mc="http://schemas.openxmlformats.org/markup-compatibility/2006" xmlns:o="urn:schemas-microsoft-com:office:office" xmlns:r="http://schemas.openxmlformats.org/officeDocument/2006/relationships" xmlns:m="http://schemas.openxmlformats.org/officeDocument/2006/math" xmlns:v="urn:schemas-microsoft-com:vml" xmlns:wp14="http://schemas.microsoft.com/office/word/2010/wordprocessingDrawing" xmlns:wp="http://schemas.openxmlformats.org/drawingml/2006/wordprocessingDrawing" xmlns:w10="urn:schemas-microsoft-com:office:word" xmlns:w="http://schemas.openxmlformats.org/wordprocessingml/2006/main" xmlns:w14="http://schemas.microsoft.com/office/word/2010/wordml" xmlns:w15="http://schemas.microsoft.com/office/word/2012/wordml" xmlns:wpg="http://schemas.microsoft.com/office/word/2010/wordprocessingGroup" xmlns:wpi="http://schemas.microsoft.com/office/word/2010/wordprocessingInk" xmlns:wne="http://schemas.microsoft.com/office/word/2006/wordml" xmlns:wps="http://schemas.microsoft.com/office/word/2010/wordprocessingShape" xmlns:cx="http://schemas.microsoft.com/office/drawing/2014/chartex" xmlns:cx1="http://schemas.microsoft.com/office/drawing/2015/9/8/chartex" xmlns:cx2="http://schemas.microsoft.com/office/drawing/2015/10/21/chartex" xmlns:cx3="http://schemas.microsoft.com/office/drawing/2016/5/9/chartex" xmlns:cx4="http://schemas.microsoft.com/office/drawing/2016/5/10/chartex" xmlns:cx5="http://schemas.microsoft.com/office/drawing/2016/5/11/chartex" xmlns:cx6="http://schemas.microsoft.com/office/drawing/2016/5/12/chartex" xmlns:cx7="http://schemas.microsoft.com/office/drawing/2016/5/13/chartex" xmlns:cx8="http://schemas.microsoft.com/office/drawing/2016/5/14/chartex" xmlns:aink="http://schemas.microsoft.com/office/drawing/2016/ink" xmlns:am3d="http://schemas.microsoft.com/office/drawing/2017/model3d" xmlns:w16cex="http://schemas.microsoft.com/office/word/2018/wordml/cex" xmlns:w16cid="http://schemas.microsoft.com/office/word/2016/wordml/cid" xmlns:w16="http://schemas.microsoft.com/office/word/2018/wordml" xmlns:w16sdtdh="http://schemas.microsoft.com/office/word/2020/wordml/sdtdatahash" xmlns:w16se="http://schemas.microsoft.com/office/word/2015/wordml/symex" mc:Ignorable="w14 w15 wp14">
   <w:body>
     <w:p>
@@ -2724,15 +2746,15 @@
         <w:spacing w:after="120" w:before="260"/>
       </w:pPr>
       <w:r>
-        <w:t xml:space="preserve">4.10 Diagnostics.* (src/Shared) - Implemented</w:t>
-      </w:r>
-    </w:p>
-    <w:p>
-      <w:pPr>
-        <w:spacing w:after="140"/>
-      </w:pPr>
-      <w:r>
-        <w:t xml:space="preserve">Responsibility: reusable, product-neutral observability library (root namespace Diagnostics.*, zero dependency on OCRWeb.*) built on NLog, per docs/diagnostics-logging-design.md. Not a bounded context - a shared technical concern like OCRWeb.Pdf, but reusable across solutions so it is developed under src/Shared rather than src/Backend.</w:t>
+        <w:t xml:space="preserve">4.10 Diagnostics.* (external NuGet package - DiagnosticLog repo) - Implemented</w:t>
+      </w:r>
+    </w:p>
+    <w:p>
+      <w:pPr>
+        <w:spacing w:after="140"/>
+      </w:pPr>
+      <w:r>
+        <w:t xml:space="preserve">Responsibility: reusable, product-neutral observability library (root namespace Diagnostics.*, zero dependency on OCRWeb.*) built on NLog, per the design doc now living in the separate DiagnosticLog repo. Not a bounded context - a shared technical concern like OCRWeb.Pdf, but reusable across solutions; originally developed in-repo under src/Shared, now extracted into its own repo (DiagnosticLog) and consumed by OCRWeb as a NuGet package.</w:t>
       </w:r>
     </w:p>
     <w:p>
@@ -2748,7 +2770,7 @@
         <w:spacing w:after="140"/>
       </w:pPr>
       <w:r>
-        <w:t xml:space="preserve">Database: separate DiagnosticLogs database (own connection string, so logging load never contends with OCRWeb) with Environments, Configurations, Categories, Logs, and Transactions tables - see docs/diagnostics-logs-schema.sql.</w:t>
+        <w:t xml:space="preserve">Database: separate DiagnosticLogs database (own connection string, so logging load never contends with OCRWeb) with Environments, Configurations, Categories, Logs, and Transactions tables - see diagnostics-logs-schema.sql in the DiagnosticLog repo (no longer in this repo's docs/).</w:t>
       </w:r>
     </w:p>
     <w:p>
@@ -2757,6 +2779,14 @@
       </w:pPr>
       <w:r>
         <w:t xml:space="preserve">Wired into OCRWeb.API: AddDiagnostics/AddDiagnosticsAspNetCore in Program.cs, app.UseDiagnostics() in the pipeline, ConnectionStrings:DiagnosticLogs and a Diagnostics:LoggerName/EnvironmentName section in appsettings. ICorrelationContext now also tracks the current user (CurrentUser/SetUser), so line logs written inside a transaction scope inherit sUser automatically, not just sTransactionId/iCategoryId/sCorrelationId. Implementation note: DbConfigProvider parses only the DB XML's &lt;rules&gt; section (minlevel per logger name); the two custom targets are constructed in code with injected dependencies rather than from XML &lt;targets&gt;.</w:t>
+      </w:r>
+    </w:p>
+    <w:p>
+      <w:pPr>
+        <w:spacing w:after="140"/>
+      </w:pPr>
+      <w:r>
+        <w:t xml:space="preserve">Now referenced via NuGet PackageReference (Diagnostics.Abstractions/.NLog/.AspNetCore, version 0.1.0) rather than ProjectReference; restored from a temporary local folder feed until published to nuget.org.</w:t>
       </w:r>
     </w:p>
     <w:p>
@@ -3273,11 +3303,7 @@
 </w:document>
 </file>
 
-<file path=word/comments.xml><?xml version="1.0" encoding="utf-8"?>
-<w:comments xmlns:cx="http://schemas.microsoft.com/office/drawing/2014/chartex" xmlns:cx1="http://schemas.microsoft.com/office/drawing/2015/9/8/chartex" xmlns:cx2="http://schemas.microsoft.com/office/drawing/2015/10/21/chartex" xmlns:cx3="http://schemas.microsoft.com/office/drawing/2016/5/9/chartex" xmlns:cx4="http://schemas.microsoft.com/office/drawing/2016/5/10/chartex" xmlns:cx5="http://schemas.microsoft.com/office/drawing/2016/5/11/chartex" xmlns:cx6="http://schemas.microsoft.com/office/drawing/2016/5/12/chartex" xmlns:cx7="http://schemas.microsoft.com/office/drawing/2016/5/13/chartex" xmlns:cx8="http://schemas.microsoft.com/office/drawing/2016/5/14/chartex" xmlns:mc="http://schemas.openxmlformats.org/markup-compatibility/2006" xmlns:aink="http://schemas.microsoft.com/office/drawing/2016/ink" xmlns:am3d="http://schemas.microsoft.com/office/drawing/2017/model3d" xmlns:o="urn:schemas-microsoft-com:office:office" xmlns:r="http://schemas.openxmlformats.org/officeDocument/2006/relationships" xmlns:m="http://schemas.openxmlformats.org/officeDocument/2006/math" xmlns:v="urn:schemas-microsoft-com:vml" xmlns:wp14="http://schemas.microsoft.com/office/word/2010/wordprocessingDrawing" xmlns:wp="http://schemas.openxmlformats.org/drawingml/2006/wordprocessingDrawing" xmlns:w10="urn:schemas-microsoft-com:office:word" xmlns:w="http://schemas.openxmlformats.org/wordprocessingml/2006/main" xmlns:w14="http://schemas.microsoft.com/office/word/2010/wordml" xmlns:w15="http://schemas.microsoft.com/office/word/2012/wordml" xmlns:w16cex="http://schemas.microsoft.com/office/word/2018/wordml/cex" xmlns:w16cid="http://schemas.microsoft.com/office/word/2016/wordml/cid" xmlns:w16="http://schemas.microsoft.com/office/word/2018/wordml" xmlns:w16sdtdh="http://schemas.microsoft.com/office/word/2020/wordml/sdtdatahash" xmlns:w16se="http://schemas.microsoft.com/office/word/2015/wordml/symex" xmlns:wpg="http://schemas.microsoft.com/office/word/2010/wordprocessingGroup" xmlns:wpi="http://schemas.microsoft.com/office/word/2010/wordprocessingInk" xmlns:wne="http://schemas.microsoft.com/office/word/2006/wordml" xmlns:wps="http://schemas.microsoft.com/office/word/2010/wordprocessingShape"/>
-</file>
-
-<file path=word/endnotes.xml><?xml version="1.0" encoding="utf-8"?>
+<file path=word\endnotes.xml><?xml version="1.0" encoding="utf-8"?>
 <w:endnotes xmlns:wpc="http://schemas.microsoft.com/office/word/2010/wordprocessingCanvas" xmlns:mc="http://schemas.openxmlformats.org/markup-compatibility/2006" xmlns:o="urn:schemas-microsoft-com:office:office" xmlns:r="http://schemas.openxmlformats.org/officeDocument/2006/relationships" xmlns:m="http://schemas.openxmlformats.org/officeDocument/2006/math" xmlns:v="urn:schemas-microsoft-com:vml" xmlns:wp14="http://schemas.microsoft.com/office/word/2010/wordprocessingDrawing" xmlns:wp="http://schemas.openxmlformats.org/drawingml/2006/wordprocessingDrawing" xmlns:w10="urn:schemas-microsoft-com:office:word" xmlns:w="http://schemas.openxmlformats.org/wordprocessingml/2006/main" xmlns:w14="http://schemas.microsoft.com/office/word/2010/wordml" xmlns:w15="http://schemas.microsoft.com/office/word/2012/wordml" xmlns:wpg="http://schemas.microsoft.com/office/word/2010/wordprocessingGroup" xmlns:wpi="http://schemas.microsoft.com/office/word/2010/wordprocessingInk" xmlns:wne="http://schemas.microsoft.com/office/word/2006/wordml" xmlns:wps="http://schemas.microsoft.com/office/word/2010/wordprocessingShape" mc:Ignorable="w14 w15 wp14">
   <w:endnote w:type="separator" w:id="-1">
     <w:p>
@@ -3314,7 +3340,11 @@
 </w:endnotes>
 </file>
 
-<file path=word/footnotes.xml><?xml version="1.0" encoding="utf-8"?>
+<file path=word\fontTable.xml><?xml version="1.0" encoding="utf-8"?>
+<w:fonts xmlns:mc="http://schemas.openxmlformats.org/markup-compatibility/2006" xmlns:r="http://schemas.openxmlformats.org/officeDocument/2006/relationships" xmlns:w="http://schemas.openxmlformats.org/wordprocessingml/2006/main" xmlns:w14="http://schemas.microsoft.com/office/word/2010/wordml" xmlns:w15="http://schemas.microsoft.com/office/word/2012/wordml" xmlns:w16cex="http://schemas.microsoft.com/office/word/2018/wordml/cex" xmlns:w16cid="http://schemas.microsoft.com/office/word/2016/wordml/cid" xmlns:w16="http://schemas.microsoft.com/office/word/2018/wordml" xmlns:w16sdtdh="http://schemas.microsoft.com/office/word/2020/wordml/sdtdatahash" xmlns:w16se="http://schemas.microsoft.com/office/word/2015/wordml/symex" mc:Ignorable="w14 w15 w16se w16cid w16 w16cex w16sdtdh"/>
+</file>
+
+<file path=word\footnotes.xml><?xml version="1.0" encoding="utf-8"?>
 <w:footnotes xmlns:wpc="http://schemas.microsoft.com/office/word/2010/wordprocessingCanvas" xmlns:mc="http://schemas.openxmlformats.org/markup-compatibility/2006" xmlns:o="urn:schemas-microsoft-com:office:office" xmlns:r="http://schemas.openxmlformats.org/officeDocument/2006/relationships" xmlns:m="http://schemas.openxmlformats.org/officeDocument/2006/math" xmlns:v="urn:schemas-microsoft-com:vml" xmlns:wp14="http://schemas.microsoft.com/office/word/2010/wordprocessingDrawing" xmlns:wp="http://schemas.openxmlformats.org/drawingml/2006/wordprocessingDrawing" xmlns:w10="urn:schemas-microsoft-com:office:word" xmlns:w="http://schemas.openxmlformats.org/wordprocessingml/2006/main" xmlns:w14="http://schemas.microsoft.com/office/word/2010/wordml" xmlns:w15="http://schemas.microsoft.com/office/word/2012/wordml" xmlns:wpg="http://schemas.microsoft.com/office/word/2010/wordprocessingGroup" xmlns:wpi="http://schemas.microsoft.com/office/word/2010/wordprocessingInk" xmlns:wne="http://schemas.microsoft.com/office/word/2006/wordml" xmlns:wps="http://schemas.microsoft.com/office/word/2010/wordprocessingShape" mc:Ignorable="w14 w15 wp14">
   <w:footnote w:type="separator" w:id="-1">
     <w:p>
@@ -3351,7 +3381,7 @@
 </w:footnotes>
 </file>
 
-<file path=word/numbering.xml><?xml version="1.0" encoding="utf-8"?>
+<file path=word\numbering.xml><?xml version="1.0" encoding="utf-8"?>
 <w:numbering xmlns:wpc="http://schemas.microsoft.com/office/word/2010/wordprocessingCanvas" xmlns:mc="http://schemas.openxmlformats.org/markup-compatibility/2006" xmlns:o="urn:schemas-microsoft-com:office:office" xmlns:r="http://schemas.openxmlformats.org/officeDocument/2006/relationships" xmlns:m="http://schemas.openxmlformats.org/officeDocument/2006/math" xmlns:v="urn:schemas-microsoft-com:vml" xmlns:wp14="http://schemas.microsoft.com/office/word/2010/wordprocessingDrawing" xmlns:wp="http://schemas.openxmlformats.org/drawingml/2006/wordprocessingDrawing" xmlns:w10="urn:schemas-microsoft-com:office:word" xmlns:w="http://schemas.openxmlformats.org/wordprocessingml/2006/main" xmlns:w14="http://schemas.microsoft.com/office/word/2010/wordml" xmlns:w15="http://schemas.microsoft.com/office/word/2012/wordml" xmlns:wpg="http://schemas.microsoft.com/office/word/2010/wordprocessingGroup" xmlns:wpi="http://schemas.microsoft.com/office/word/2010/wordprocessingInk" xmlns:wne="http://schemas.microsoft.com/office/word/2006/wordml" xmlns:wps="http://schemas.microsoft.com/office/word/2010/wordprocessingShape" mc:Ignorable="w14 w15 wp14">
   <w:abstractNum w:abstractNumId="1" w15:restartNumberingAfterBreak="0">
     <w:multiLevelType w:val="hybridMultilevel"/>
@@ -3464,7 +3494,17 @@
 </w:numbering>
 </file>
 
-<file path=word/styles.xml><?xml version="1.0" encoding="utf-8"?>
+<file path=word\settings.xml><?xml version="1.0" encoding="utf-8"?>
+<w:settings xmlns:wpc="http://schemas.microsoft.com/office/word/2010/wordprocessingCanvas" xmlns:mc="http://schemas.openxmlformats.org/markup-compatibility/2006" xmlns:o="urn:schemas-microsoft-com:office:office" xmlns:r="http://schemas.openxmlformats.org/officeDocument/2006/relationships" xmlns:m="http://schemas.openxmlformats.org/officeDocument/2006/math" xmlns:v="urn:schemas-microsoft-com:vml" xmlns:wp14="http://schemas.microsoft.com/office/word/2010/wordprocessingDrawing" xmlns:wp="http://schemas.openxmlformats.org/drawingml/2006/wordprocessingDrawing" xmlns:w10="urn:schemas-microsoft-com:office:word" xmlns:w="http://schemas.openxmlformats.org/wordprocessingml/2006/main" xmlns:w14="http://schemas.microsoft.com/office/word/2010/wordml" xmlns:w15="http://schemas.microsoft.com/office/word/2012/wordml" xmlns:wpg="http://schemas.microsoft.com/office/word/2010/wordprocessingGroup" xmlns:wpi="http://schemas.microsoft.com/office/word/2010/wordprocessingInk" xmlns:wne="http://schemas.microsoft.com/office/word/2006/wordml" xmlns:wps="http://schemas.microsoft.com/office/word/2010/wordprocessingShape" mc:Ignorable="w14 w15 wp14">
+  <w:displayBackgroundShape/>
+  <w:evenAndOddHeaders w:val="false"/>
+  <w:compat>
+    <w:compatSetting w:val="15" w:name="compatibilityMode" w:uri="http://schemas.microsoft.com/office/word"/>
+  </w:compat>
+</w:settings>
+</file>
+
+<file path=word\styles.xml><?xml version="1.0" encoding="utf-8"?>
 <w:styles xmlns:mc="http://schemas.openxmlformats.org/markup-compatibility/2006" xmlns:r="http://schemas.openxmlformats.org/officeDocument/2006/relationships" xmlns:w="http://schemas.openxmlformats.org/wordprocessingml/2006/main" xmlns:w14="http://schemas.microsoft.com/office/word/2010/wordml" xmlns:w15="http://schemas.microsoft.com/office/word/2012/wordml" mc:Ignorable="w14 w15">
   <w:docDefaults>
     <w:rPrDefault/>

</xml_diff>

<commit_message>
feat(backend): wire Diagnostics.* logging + correlation propagation into OCRWeb.Bff
OCRWeb.Bff now has its own diagnostics pipeline (line logs + transaction
spans to DiagnosticLogs, LoggerName "OCRWeb.Bff") and forwards the current
request's X-Correlation-ID on its OCRWeb.API HttpClient (IIdentityApiClient)
via AddDiagnosticsCorrelationPropagation(), so a single trace id spans a
request from the Bff through to the API instead of stopping at the Bff.
Adds host.docker.internal extra_hosts to the bff compose service to reach
the same DiagnosticLogs database as the API container.

Co-Authored-By: Claude Sonnet 5 <noreply@anthropic.com>
</commit_message>
<xml_diff>
--- a/development-plan.docx
+++ b/development-plan.docx
@@ -2688,6 +2688,14 @@
       </w:pPr>
       <w:r>
         <w:t xml:space="preserve">Database: none. Calls OCRWeb.API's internal endpoints over HTTP, authenticated with a self-minted RS256 token (Bff holds the private key, API holds only the public key).</w:t>
+      </w:r>
+    </w:p>
+    <w:p>
+      <w:pPr>
+        <w:spacing w:after="140"/>
+      </w:pPr>
+      <w:r>
+        <w:t xml:space="preserve">Diagnostics: wired to the same Diagnostics.* logging library as OCRWeb.API (own DiagnosticLogs connection, LoggerName "OCRWeb.Bff"), including outbound X-Correlation-ID propagation on its OCRWeb.API HttpClient (IIdentityApiClient) so a request can be traced across both services.</w:t>
       </w:r>
     </w:p>
     <w:p>

</xml_diff>

<commit_message>
feat(backend): expose Identity permission commands via internal FastEndpoints test(identity): add unit tests for user and security-rule command handlers docs: document security-rule permission model and update development plan
</commit_message>
<xml_diff>
--- a/development-plan.docx
+++ b/development-plan.docx
@@ -467,7 +467,7 @@
                 <w:b w:val="false"/>
                 <w:bCs w:val="false"/>
               </w:rPr>
-              <w:t xml:space="preserve">Entity/User, Entity/ExternalLogin; Repositories/IUserRepository; IUserRegistrationPolicy</w:t>
+              <w:t xml:space="preserve">Entity/User, Entity/ExternalLogin, Entity/SecurityRuleCategory, Entity/SecurityRuleItem, Entity/SecurityUserRuleItem; Enums/RuleType; Repositories/IUserRepository, ISecurityRuleCategoryRepository, ISecurityRuleItemRepository, ISecurityUserRuleItemRepository; IUserRegistrationPolicy</w:t>
             </w:r>
           </w:p>
         </w:tc>
@@ -497,7 +497,7 @@
                 <w:b w:val="false"/>
                 <w:bCs w:val="false"/>
               </w:rPr>
-              <w:t xml:space="preserve">Commands/ProvisionGoogleUser; Queries/IsUserActive</w:t>
+              <w:t xml:space="preserve">Commands/ProvisionGoogleUser, AddUser, UpdateUser, DeleteUser, AddSecurityRuleCategory, UpdateSecurityRuleCategory, DeleteSecurityRuleCategory, AddSecurityRuleItem, UpdateSecurityRuleItem, DeleteSecurityRuleItem; Queries/IsUserActive</w:t>
             </w:r>
           </w:p>
         </w:tc>
@@ -527,7 +527,7 @@
                 <w:b w:val="false"/>
                 <w:bCs w:val="false"/>
               </w:rPr>
-              <w:t xml:space="preserve">UserDbContext; Configurations (User, ExternalLogin); Repositories; ConfigurationUserRegistrationPolicy; Seeding (UserDbSeeder + SeedOptions); DesignTimeDbContextFactory; ModuleRegistration</w:t>
+              <w:t xml:space="preserve">UserDbContext; Configurations (User, ExternalLogin, SecurityRuleCategory, SecurityRuleItem, SecurityUserRuleItem); Repositories; ConfigurationUserRegistrationPolicy; Seeding (UserDbSeeder + SeedOptions); DesignTimeDbContextFactory; ModuleRegistration</w:t>
             </w:r>
           </w:p>
         </w:tc>
@@ -901,6 +901,100 @@
                 <w:sz w:val="20"/>
                 <w:szCs w:val="20"/>
               </w:rPr>
+              <w:t xml:space="preserve">btIsTemplateUser</w:t>
+            </w:r>
+          </w:p>
+        </w:tc>
+        <w:tc>
+          <w:tcPr>
+            <w:tcW w:type="dxa" w:w="2000"/>
+          </w:tcPr>
+          <w:p>
+            <w:r>
+              <w:rPr>
+                <w:b w:val="false"/>
+                <w:bCs w:val="false"/>
+              </w:rPr>
+              <w:t xml:space="preserve">bit</w:t>
+            </w:r>
+          </w:p>
+        </w:tc>
+        <w:tc>
+          <w:tcPr>
+            <w:tcW w:type="dxa" w:w="5350"/>
+          </w:tcPr>
+          <w:p>
+            <w:r>
+              <w:rPr>
+                <w:b w:val="false"/>
+                <w:bCs w:val="false"/>
+              </w:rPr>
+              <w:t xml:space="preserve">default 0; marks this user reusable as a permission template for other users</w:t>
+            </w:r>
+          </w:p>
+        </w:tc>
+      </w:tr>
+      <w:tr>
+        <w:tc>
+          <w:tcPr>
+            <w:tcW w:type="dxa" w:w="2000"/>
+          </w:tcPr>
+          <w:p>
+            <w:r>
+              <w:rPr>
+                <w:rFonts w:ascii="Consolas" w:cs="Consolas" w:eastAsia="Consolas" w:hAnsi="Consolas"/>
+                <w:b w:val="false"/>
+                <w:bCs w:val="false"/>
+                <w:sz w:val="20"/>
+                <w:szCs w:val="20"/>
+              </w:rPr>
+              <w:t xml:space="preserve">iParentId</w:t>
+            </w:r>
+          </w:p>
+        </w:tc>
+        <w:tc>
+          <w:tcPr>
+            <w:tcW w:type="dxa" w:w="2000"/>
+          </w:tcPr>
+          <w:p>
+            <w:r>
+              <w:rPr>
+                <w:b w:val="false"/>
+                <w:bCs w:val="false"/>
+              </w:rPr>
+              <w:t xml:space="preserve">int</w:t>
+            </w:r>
+          </w:p>
+        </w:tc>
+        <w:tc>
+          <w:tcPr>
+            <w:tcW w:type="dxa" w:w="5350"/>
+          </w:tcPr>
+          <w:p>
+            <w:r>
+              <w:rPr>
+                <w:b w:val="false"/>
+                <w:bCs w:val="false"/>
+              </w:rPr>
+              <w:t xml:space="preserve">nullable, self-FK (Restrict) -&gt; Users; template user this user inherits permissions from (one level only)</w:t>
+            </w:r>
+          </w:p>
+        </w:tc>
+      </w:tr>
+      <w:tr>
+        <w:tc>
+          <w:tcPr>
+            <w:tcW w:type="dxa" w:w="2000"/>
+          </w:tcPr>
+          <w:p>
+            <w:r>
+              <w:rPr>
+                <w:rFonts w:ascii="Consolas" w:cs="Consolas" w:eastAsia="Consolas" w:hAnsi="Consolas"/>
+                <w:b w:val="false"/>
+                <w:bCs w:val="false"/>
+                <w:sz w:val="20"/>
+                <w:szCs w:val="20"/>
+              </w:rPr>
               <w:t xml:space="preserve">dtInsertedTime</w:t>
             </w:r>
           </w:p>
@@ -1290,6 +1384,14 @@
         </w:tc>
       </w:tr>
     </w:tbl>
+    <w:p>
+      <w:pPr>
+        <w:spacing w:after="140"/>
+      </w:pPr>
+      <w:r>
+        <w:t xml:space="preserve">Database: [identity].[SecurityRuleCategory], [SecurityRuleItems], [SecurityUserRuleItems] — permission catalog (category + rule code, RuleType Boolean/Integer/Decimal) and per-user assignment. No Role entity: grouping is done via template users (Users.btIsTemplateUser / iParentId above) instead of a Role/UserRole join — a user with iParentId inherits 100% from that template user rather than having its own assignment rows. Full schema, business rules, and endpoint list in docs/Identity/security-rules-permission-design.md (+ security-rules-schema.sql).</w:t>
+      </w:r>
+    </w:p>
     <w:p>
       <w:pPr>
         <w:spacing w:after="140"/>

</xml_diff>

<commit_message>
feat(frontend): add body-content iframe to the post-login shell
/home now hosts a same-origin iframe (environment.bodyAppUrl, build-time
config wired via angular.json's production fileReplacements) that fills the
viewport flush below the header, instead of its own upload/project-list
screens — those are expected to live in a separate embedded body app (e.g. a
future OCR web), not in this template shell. Shows a placeholder when no URL
is configured, since no body app exists yet. Syncs development-plan.docx
(OCRWeb.Frontend/OCRWeb.Frontend.Shared were stale at "Scaffold" despite the
header redesign, shared component library, and admin UI already built) and
adds docs/Frontend/body-content-iframe-design.md.

Co-Authored-By: Claude Sonnet 5 <noreply@anthropic.com>
</commit_message>
<xml_diff>
--- a/development-plan.docx
+++ b/development-plan.docx
@@ -2806,23 +2806,23 @@
         <w:spacing w:after="120" w:before="260"/>
       </w:pPr>
       <w:r>
-        <w:t xml:space="preserve">4.8 OCRWeb.Frontend - Scaffold</w:t>
-      </w:r>
-    </w:p>
-    <w:p>
-      <w:pPr>
-        <w:spacing w:after="140"/>
-      </w:pPr>
-      <w:r>
-        <w:t xml:space="preserve">Responsibility: Angular 22 application (upload UI, project list, workspace) and Google sign-in UI. Talks only to the BFF.</w:t>
-      </w:r>
-    </w:p>
-    <w:p>
-      <w:pPr>
-        <w:spacing w:after="140"/>
-      </w:pPr>
-      <w:r>
-        <w:t xml:space="preserve">Scaffolded (ng new + ng add @angular/material) with a working Google sign-in flow: AuthService (session state via /bff/me), a route guard, a session-aware header, and an /auth-error page. Project list / upload / workspace screens are not built yet — see Design.md for the planned screen list, blocked on OCRWeb.ProjectManagement (§4.5).</w:t>
+        <w:t xml:space="preserve">4.8 OCRWeb.Frontend - Partial Implemented</w:t>
+      </w:r>
+    </w:p>
+    <w:p>
+      <w:pPr>
+        <w:spacing w:after="140"/>
+      </w:pPr>
+      <w:r>
+        <w:t xml:space="preserve">Responsibility: Angular 22 application - shell (header, session, admin UI) plus a body-content area that embeds a per-deployment Angular body app (e.g. a future OCR web) via a same-origin iframe. Talks only to the BFF.</w:t>
+      </w:r>
+    </w:p>
+    <w:p>
+      <w:pPr>
+        <w:spacing w:after="140"/>
+      </w:pPr>
+      <w:r>
+        <w:t xml:space="preserve">Session flow: Google sign-in with a persistent cookie (ASP.NET Core Data Protection keys mounted to a Docker volume so it survives container restarts), AuthService/IdentityService (session state via /bff/me and /bff/me/permissions), authGuard (login required) and adminGuard (IsAdmin required, redirects a non-admin to /home) route guards. Header (built on OCRWeb.Frontend.Shared's Avatar and IdentityService) shows a dark app bar with a "Hello, {name}" dropdown: Settings (self-service avatar upload) for everyone, Manage Users / Manage Rules / Manage Themes (placeholder) for admins. Admin CRUD screens exist for Users, SecurityRuleCategories, and SecurityRuleItems (list, add/edit dialog, ConfirmDialog delete confirmation). /home is the post-login landing route; it no longer plans its own upload/project-list/workspace screens - those are expected to live in a separate embedded body app (see below), not in this shell. Body-content area: /home renders a same-origin iframe whose src is environment.bodyAppUrl (Angular environment.ts, build-time - the URL is expected to change rarely, e.g. once per project setup, so a rebuild-to-change tradeoff was accepted over a runtime config file). Shows a placeholder message when unset, e.g. before an OCR web project exists. The iframe fills the full viewport below the fixed header with no gap; the shell contributes only the header bar, per the approved design.</w:t>
       </w:r>
     </w:p>
     <w:p>
@@ -2831,23 +2831,23 @@
         <w:spacing w:after="120" w:before="260"/>
       </w:pPr>
       <w:r>
-        <w:t xml:space="preserve">4.9 OCRWeb.Frontend.Shared - Scaffold</w:t>
-      </w:r>
-    </w:p>
-    <w:p>
-      <w:pPr>
-        <w:spacing w:after="140"/>
-      </w:pPr>
-      <w:r>
-        <w:t xml:space="preserve">Responsibility: Angular 22 shared component library for frontend-only reusable UI (Text, Label, Button, CropPdf, popup/window/form primitives).</w:t>
-      </w:r>
-    </w:p>
-    <w:p>
-      <w:pPr>
-        <w:spacing w:after="140"/>
-      </w:pPr>
-      <w:r>
-        <w:t xml:space="preserve">Scaffolded as its own library workspace (ng new --no-create-application + ng generate library); no components implemented yet.</w:t>
+        <w:t xml:space="preserve">4.9 OCRWeb.Frontend.Shared - Partial Implemented</w:t>
+      </w:r>
+    </w:p>
+    <w:p>
+      <w:pPr>
+        <w:spacing w:after="140"/>
+      </w:pPr>
+      <w:r>
+        <w:t xml:space="preserve">Responsibility: Angular 22 shared component library for reusable UI and auth/session state, consumed by both the OCRWeb.Frontend shell and any future Angular body app embedded in its iframe (e.g. a future OCR web), so they share styling and auth plumbing with no extra wiring.</w:t>
+      </w:r>
+    </w:p>
+    <w:p>
+      <w:pPr>
+        <w:spacing w:after="140"/>
+      </w:pPr>
+      <w:r>
+        <w:t xml:space="preserve">Built as its own library workspace (ng new --no-create-application + ng generate library), packed via npm pack and consumed as a tarball dependency rather than a raw file: path - a symlinked directory resolves its own @angular/core copy and breaks DI with a duplicate core instance (NG0203). Implemented: IdentityService (current user and effective permissions via /bff/me, /bff/me/permissions), Avatar (self or other users' avatar image), ConfirmDialog (replaces the browser confirm() in admin delete flows), and a shared Material 3 theme mixin (theme.scss). CropPdf and other body-app-specific primitives are not built yet - out of scope until a body app needs them.</w:t>
       </w:r>
     </w:p>
     <w:p>

</xml_diff>

<commit_message>
feat(frontend,backend)!: adopt @orangepuff/portal-frontend(-shared) and bump OrangepuffPortal.* to 1.0.2
Rebuild OCRWeb.Frontend as a thin Angular shell around the published
@orangepuff/portal-frontend / @orangepuff/portal-frontend-shared npm
packages (mirrors OrangepuffPortal.Host on the backend), replacing the
removed local OCRWeb.Frontend.Shared library. Bump OrangepuffPortal.Host
and OrangepuffPortal.Shared to 1.0.2. Work around an upstream peerDependency
bug in portal-frontend@1.0.2 with an npm `overrides` entry.

Co-Authored-By: Claude Sonnet 5 <noreply@anthropic.com>
</commit_message>
<xml_diff>
--- a/development-plan.docx
+++ b/development-plan.docx
@@ -189,7 +189,7 @@
         <w:spacing w:after="140"/>
       </w:pPr>
       <w:r>
-        <w:t xml:space="preserve">The backend is a modular monolith: a single API host (OCRWeb.API) exposes FastEndpoints that delegate to MediatR handlers inside per-context modules. Each bounded context is a class library split into Domain / Application / Infrastructure. Persistence is a single SQL Server database (OCRWeb) with one schema and one EF Core DbContext per context; contexts reference each other by id only. Identity, cookie/Google-OAuth auth, and the /bff/* routes now come from the OrangepuffPortal.Host NuGet package (published from the sibling orangepuffportal repo, itself originally extracted from this project's former OCRWeb.Identity/OCRWeb.Bff/OCRWeb.Shared) rather than in-repo projects -- this collapsed OCRWeb from two processes (API + Bff talking over an internal RS256 JWT hop) into one.</w:t>
+        <w:t xml:space="preserve">The backend is a modular monolith: a single API host (OCRWeb.API) exposes FastEndpoints that delegate to MediatR handlers inside per-context modules. Each bounded context is a class library split into Domain / Application / Infrastructure. Persistence is a single SQL Server database (OCRWeb) with one schema and one EF Core DbContext per context; contexts reference each other by id only. Identity, cookie/Google-OAuth auth, and the /bff/* routes now come from the OrangepuffPortal.Host NuGet package (published from the sibling orangepuffportal repo, itself originally extracted from this project's former OCRWeb.Identity/OCRWeb.Bff/OCRWeb.Shared) rather than in-repo projects -- this collapsed OCRWeb from two processes (API + Bff talking over an internal RS256 JWT hop) into one. The same pattern now applies to the frontend: the Angular shell (header, session, admin UI) is bootstrapped from the @orangepuff/portal-frontend npm package, with shared UI/auth pieces (IdentityService, Avatar, ConfirmDialog, theme.scss) from @orangepuff/portal-frontend-shared, replacing what used to be the local OCRWeb.Frontend.Shared library.</w:t>
       </w:r>
     </w:p>
     <w:p>
@@ -2708,15 +2708,15 @@
         <w:spacing w:after="140"/>
       </w:pPr>
       <w:r>
-        <w:t xml:space="preserve">Responsibility: Angular 22 application - shell (header, session, admin UI) plus a body-content area that embeds a per-deployment Angular body app (e.g. a future OCR web) via a same-origin iframe. Talks only to the BFF.</w:t>
-      </w:r>
-    </w:p>
-    <w:p>
-      <w:pPr>
-        <w:spacing w:after="140"/>
-      </w:pPr>
-      <w:r>
-        <w:t xml:space="preserve">Session flow: Google sign-in with a persistent cookie (ASP.NET Core Data Protection keys mounted to a Docker volume so it survives container restarts), AuthService/IdentityService (session state via /bff/me and /bff/me/permissions), authGuard (login required) and adminGuard (IsAdmin required, redirects a non-admin to /home) route guards. Header (built on OCRWeb.Frontend.Shared's Avatar and IdentityService) shows a dark app bar with a "Hello, {name}" dropdown: Settings (self-service avatar upload) for everyone, Manage Users / Manage Rules / Manage Themes (placeholder) for admins. Admin CRUD screens exist for Users, SecurityRuleCategories, and SecurityRuleItems (list, add/edit dialog, ConfirmDialog delete confirmation). /home is the post-login landing route; it no longer plans its own upload/project-list/workspace screens - those are expected to live in a separate embedded body app (see below), not in this shell. Body-content area: /home renders a same-origin iframe whose src is environment.bodyAppUrl (Angular environment.ts, build-time - the URL is expected to change rarely, e.g. once per project setup, so a rebuild-to-change tradeoff was accepted over a runtime config file). Shows a placeholder message when unset, e.g. before an OCR web project exists. The iframe fills the full viewport below the fixed header with no gap; the shell contributes only the header bar, per the approved design.</w:t>
+        <w:t xml:space="preserve">Responsibility: Angular 22 application - a thin shell (header, session, admin UI) plus a body-content area that embeds a per-deployment Angular body app (e.g. a future OCR web) via a same-origin iframe. Talks only to the BFF. The shell itself (PortalShell component, routes, header, session, admin UI) is bootstrapped from the @orangepuff/portal-frontend npm package rather than built locally -- OCRWeb.Frontend's own code is now just package.json/angular.json wiring plus src/main.ts (bootstrapApplication(PortalShell, appConfig)) and src/app/app.config.ts (providePortalShell({ appName: 'OCRWeb', bffOrigin }), PORTAL_SHELL_ROUTES).</w:t>
+      </w:r>
+    </w:p>
+    <w:p>
+      <w:pPr>
+        <w:spacing w:after="140"/>
+      </w:pPr>
+      <w:r>
+        <w:t xml:space="preserve">Session flow: Google sign-in with a persistent cookie (ASP.NET Core Data Protection keys mounted to a Docker volume so it survives container restarts), AuthService/IdentityService (session state via /bff/me and /bff/me/permissions), authGuard (login required) and adminGuard (IsAdmin required, redirects a non-admin to /home) route guards -- all now exported by @orangepuff/portal-frontend rather than living under OCRWeb.Frontend/src/app. Header (built on @orangepuff/portal-frontend-shared's Avatar and IdentityService) shows a dark app bar with a "Hello, {name}" dropdown: Settings (self-service avatar upload) for everyone, Manage Users / Manage Rules / Manage Themes (placeholder) for admins. Admin CRUD screens exist for Users, SecurityRuleCategories, and SecurityRuleItems (list, add/edit dialog, ConfirmDialog delete confirmation). /home is the post-login landing route; it no longer plans its own upload/project-list/workspace screens - those are expected to live in a separate embedded body app (see below), not in this shell. Body-content area: /home renders a same-origin iframe whose src is PortalShellConfig.bodyAppUrl, passed to providePortalShell() in src/app/app.config.ts (build-time - the URL is expected to change rarely, e.g. once per project setup, so a rebuild-to-change tradeoff was accepted over a runtime config file). OCRWeb.Frontend does not set bodyAppUrl yet, so Home renders the package's placeholder message; no OCR web body app exists yet. The iframe fills the full viewport below the fixed header with no gap; the shell contributes only the header bar, per the approved design. Known issue: the published @orangepuff/portal-frontend@1.0.2 package.json still pins its @orangepuff/portal-frontend-shared peerDependency to the stale pre-release range ^0.0.1 instead of ^1.0.2 (an upstream packaging bug in the orangepuffportal repo's publish step); OCRWeb.Frontend/package.json works around it with an npm "overrides" entry pinning the nested peer to the root @orangepuff/portal-frontend-shared version, to be dropped once upstream is fixed and republished.</w:t>
       </w:r>
     </w:p>
     <w:p>
@@ -2725,23 +2725,15 @@
         <w:spacing w:after="120" w:before="260"/>
       </w:pPr>
       <w:r>
-        <w:t xml:space="preserve">4.9 OCRWeb.Frontend.Shared - Partial Implemented</w:t>
-      </w:r>
-    </w:p>
-    <w:p>
-      <w:pPr>
-        <w:spacing w:after="140"/>
-      </w:pPr>
-      <w:r>
-        <w:t xml:space="preserve">Responsibility: Angular 22 shared component library for reusable UI and auth/session state, consumed by both the OCRWeb.Frontend shell and any future Angular body app embedded in its iframe (e.g. a future OCR web), so they share styling and auth plumbing with no extra wiring.</w:t>
-      </w:r>
-    </w:p>
-    <w:p>
-      <w:pPr>
-        <w:spacing w:after="140"/>
-      </w:pPr>
-      <w:r>
-        <w:t xml:space="preserve">Built as its own library workspace (ng new --no-create-application + ng generate library), packed via npm pack and consumed as a tarball dependency rather than a raw file: path - a symlinked directory resolves its own @angular/core copy and breaks DI with a duplicate core instance (NG0203). Implemented: IdentityService (current user and effective permissions via /bff/me, /bff/me/permissions), Avatar (self or other users' avatar image), ConfirmDialog (replaces the browser confirm() in admin delete flows), and a shared Material 3 theme mixin (theme.scss). CropPdf and other body-app-specific primitives are not built yet - out of scope until a body app needs them.</w:t>
+        <w:t xml:space="preserve">4.9 OCRWeb.Frontend.Shared - Removed</w:t>
+      </w:r>
+    </w:p>
+    <w:p>
+      <w:pPr>
+        <w:spacing w:after="140"/>
+      </w:pPr>
+      <w:r>
+        <w:t xml:space="preserve">Removed: superseded by the @orangepuff/portal-frontend-shared npm package (published from the sibling orangepuffportal repo, itself originally extracted from this project's local Angular library workspace), same pattern as OCRWeb.Shared/OCRWeb.Identity being superseded by the OrangepuffPortal.* NuGet packages on the backend. It still supplies the same reusable pieces this project's library used to (IdentityService, Avatar, ConfirmDialog, the shared Material 3 theme.scss mixin), now consumed by OCRWeb.Frontend as a versioned npm dependency instead of a locally built-and-tarball-packed library. CropPdf and other body-app-specific primitives remain out of scope until a body app needs them.</w:t>
       </w:r>
     </w:p>
     <w:p>

</xml_diff>